<commit_message>
fix(eval): regenerate stale time-new-roman fixture to isolate B1 impact
original.docx for vi/unicode/time-new-roman had empty "Phụ trách"/"Trạng
thái" columns while input.pdf genuinely contains values there (confirmed
via direct PyMuPDF extraction) - pdf2docx's output was more complete than
the reference fixture. Filled in the 5 missing cell values via python-docx
so the sample's score reflects real bugs, not fixture staleness.

Isolated numbers for this sample: text_sim 0.9622->0.9653, text_strict
0.7123->0.7397, ssim 0.8197->0.8183, changed 21->19. Remaining gap is B1
(table row content spilling across row boundaries), documented in
eval/ISSUES.md alongside the current full score table after B4(a)/B4(d).
</commit_message>
<xml_diff>
--- a/eval/samples/vi/unicode/time-new-roman/original.docx
+++ b/eval/samples/vi/unicode/time-new-roman/original.docx
@@ -574,6 +574,7 @@
               <w:rPr>
                 <w:rtl w:val="0"/>
               </w:rPr>
+              <w:t>VƯƠNG</w:t>
             </w:r>
           </w:p>
         </w:tc>
@@ -607,6 +608,7 @@
               <w:rPr>
                 <w:rtl w:val="0"/>
               </w:rPr>
+              <w:t>Hoàn thành</w:t>
             </w:r>
           </w:p>
         </w:tc>
@@ -673,6 +675,7 @@
               <w:rPr>
                 <w:rtl w:val="0"/>
               </w:rPr>
+              <w:t>VƯƠNG</w:t>
             </w:r>
           </w:p>
         </w:tc>
@@ -706,6 +709,7 @@
               <w:rPr>
                 <w:rtl w:val="0"/>
               </w:rPr>
+              <w:t>Đang thực hiện</w:t>
             </w:r>
           </w:p>
         </w:tc>
@@ -772,6 +776,7 @@
               <w:rPr>
                 <w:rtl w:val="0"/>
               </w:rPr>
+              <w:t>ĐĂNG</w:t>
             </w:r>
           </w:p>
         </w:tc>
@@ -805,6 +810,7 @@
               <w:rPr>
                 <w:rtl w:val="0"/>
               </w:rPr>
+              <w:t>Hoàn thành</w:t>
             </w:r>
           </w:p>
         </w:tc>
@@ -871,6 +877,7 @@
               <w:rPr>
                 <w:rtl w:val="0"/>
               </w:rPr>
+              <w:t>Nguyễn T. Dũng</w:t>
             </w:r>
           </w:p>
         </w:tc>
@@ -904,6 +911,7 @@
               <w:rPr>
                 <w:rtl w:val="0"/>
               </w:rPr>
+              <w:t>Đã tiếp nhận</w:t>
             </w:r>
           </w:p>
         </w:tc>
@@ -970,6 +978,7 @@
               <w:rPr>
                 <w:rtl w:val="0"/>
               </w:rPr>
+              <w:t>ĐĂNG</w:t>
             </w:r>
           </w:p>
         </w:tc>
@@ -1003,6 +1012,7 @@
               <w:rPr>
                 <w:rtl w:val="0"/>
               </w:rPr>
+              <w:t>Chờ xử lý</w:t>
             </w:r>
           </w:p>
         </w:tc>

</xml_diff>